<commit_message>
Cotización CFT 1267913-13-COT26 con estilo Studios Conari; plantilla reutilizable
Co-Authored-By: Claude Opus 5.5 <noreply@anthropic.com>
Claude-Session: https://claude.ai/code/session_01SfkxKP6KzgHJNPZStZzsYX
</commit_message>
<xml_diff>
--- a/Barrido_2026-10-26/03_Compra_Agil/1267913-13-COT26_CFTAntofagasta_capsulas_1M_cierra_30-10/ENVIAR/Cotizacion_Propuesta_1267913-13-COT26_StudiosConari.docx
+++ b/Barrido_2026-10-26/03_Compra_Agil/1267913-13-COT26_CFTAntofagasta_capsulas_1M_cierra_30-10/ENVIAR/Cotizacion_Propuesta_1267913-13-COT26_StudiosConari.docx
@@ -10,7 +10,7 @@
         <w:rPr>
           <w:b/>
           <w:i w:val="0"/>
-          <w:color w:val="2B3A55"/>
+          <w:color w:val="15294A"/>
           <w:sz w:val="28"/>
         </w:rPr>
         <w:t>STUDIOS CONARI SpA</w:t>
@@ -232,7 +232,7 @@
         <w:rPr>
           <w:b/>
           <w:i w:val="0"/>
-          <w:color w:val="2B3A55"/>
+          <w:color w:val="A8780F"/>
           <w:sz w:val="23"/>
         </w:rPr>
         <w:t>1. Oferta económica</w:t>
@@ -255,13 +255,14 @@
         <w:tc>
           <w:tcPr>
             <w:tcW w:type="dxa" w:w="4309"/>
-            <w:shd w:val="clear" w:color="auto" w:fill="DCE3EE"/>
+            <w:shd w:val="clear" w:color="auto" w:fill="F7EFD8"/>
           </w:tcPr>
           <w:p>
             <w:r/>
             <w:r>
               <w:rPr>
                 <w:b/>
+                <w:color w:val="A8780F"/>
                 <w:sz w:val="16"/>
               </w:rPr>
               <w:t>Ítem</w:t>
@@ -271,13 +272,14 @@
         <w:tc>
           <w:tcPr>
             <w:tcW w:type="dxa" w:w="1134"/>
-            <w:shd w:val="clear" w:color="auto" w:fill="DCE3EE"/>
+            <w:shd w:val="clear" w:color="auto" w:fill="F7EFD8"/>
           </w:tcPr>
           <w:p>
             <w:r/>
             <w:r>
               <w:rPr>
                 <w:b/>
+                <w:color w:val="A8780F"/>
                 <w:sz w:val="16"/>
               </w:rPr>
               <w:t>Cantidad</w:t>
@@ -287,13 +289,14 @@
         <w:tc>
           <w:tcPr>
             <w:tcW w:type="dxa" w:w="1928"/>
-            <w:shd w:val="clear" w:color="auto" w:fill="DCE3EE"/>
+            <w:shd w:val="clear" w:color="auto" w:fill="F7EFD8"/>
           </w:tcPr>
           <w:p>
             <w:r/>
             <w:r>
               <w:rPr>
                 <w:b/>
+                <w:color w:val="A8780F"/>
                 <w:sz w:val="16"/>
               </w:rPr>
               <w:t>Valor unitario neto</w:t>
@@ -303,13 +306,14 @@
         <w:tc>
           <w:tcPr>
             <w:tcW w:type="dxa" w:w="1984"/>
-            <w:shd w:val="clear" w:color="auto" w:fill="DCE3EE"/>
+            <w:shd w:val="clear" w:color="auto" w:fill="F7EFD8"/>
           </w:tcPr>
           <w:p>
             <w:r/>
             <w:r>
               <w:rPr>
                 <w:b/>
+                <w:color w:val="A8780F"/>
                 <w:sz w:val="16"/>
               </w:rPr>
               <w:t>Total neto</w:t>
@@ -575,7 +579,7 @@
         <w:rPr>
           <w:b/>
           <w:i w:val="0"/>
-          <w:color w:val="2B3A55"/>
+          <w:color w:val="A8780F"/>
           <w:sz w:val="23"/>
         </w:rPr>
         <w:t>2. Lo que entregamos (cumplimiento del estándar solicitado)</w:t>
@@ -596,13 +600,14 @@
         <w:tc>
           <w:tcPr>
             <w:tcW w:type="dxa" w:w="3118"/>
-            <w:shd w:val="clear" w:color="auto" w:fill="DCE3EE"/>
+            <w:shd w:val="clear" w:color="auto" w:fill="F7EFD8"/>
           </w:tcPr>
           <w:p>
             <w:r/>
             <w:r>
               <w:rPr>
                 <w:b/>
+                <w:color w:val="A8780F"/>
                 <w:sz w:val="16"/>
               </w:rPr>
               <w:t>Requisito de la compra</w:t>
@@ -612,13 +617,14 @@
         <w:tc>
           <w:tcPr>
             <w:tcW w:type="dxa" w:w="6236"/>
-            <w:shd w:val="clear" w:color="auto" w:fill="DCE3EE"/>
+            <w:shd w:val="clear" w:color="auto" w:fill="F7EFD8"/>
           </w:tcPr>
           <w:p>
             <w:r/>
             <w:r>
               <w:rPr>
                 <w:b/>
+                <w:color w:val="A8780F"/>
                 <w:sz w:val="16"/>
               </w:rPr>
               <w:t>Cómo lo cumplimos</w:t>
@@ -856,7 +862,7 @@
         <w:rPr>
           <w:b/>
           <w:i w:val="0"/>
-          <w:color w:val="2B3A55"/>
+          <w:color w:val="A8780F"/>
           <w:sz w:val="23"/>
         </w:rPr>
         <w:t>3. Propuesta creativa</w:t>
@@ -914,13 +920,14 @@
         <w:tc>
           <w:tcPr>
             <w:tcW w:type="dxa" w:w="510"/>
-            <w:shd w:val="clear" w:color="auto" w:fill="DCE3EE"/>
+            <w:shd w:val="clear" w:color="auto" w:fill="F7EFD8"/>
           </w:tcPr>
           <w:p>
             <w:r/>
             <w:r>
               <w:rPr>
                 <w:b/>
+                <w:color w:val="A8780F"/>
                 <w:sz w:val="16"/>
               </w:rPr>
               <w:t>N°</w:t>
@@ -930,13 +937,14 @@
         <w:tc>
           <w:tcPr>
             <w:tcW w:type="dxa" w:w="2835"/>
-            <w:shd w:val="clear" w:color="auto" w:fill="DCE3EE"/>
+            <w:shd w:val="clear" w:color="auto" w:fill="F7EFD8"/>
           </w:tcPr>
           <w:p>
             <w:r/>
             <w:r>
               <w:rPr>
                 <w:b/>
+                <w:color w:val="A8780F"/>
                 <w:sz w:val="16"/>
               </w:rPr>
               <w:t>Cápsula</w:t>
@@ -946,13 +954,14 @@
         <w:tc>
           <w:tcPr>
             <w:tcW w:type="dxa" w:w="6009"/>
-            <w:shd w:val="clear" w:color="auto" w:fill="DCE3EE"/>
+            <w:shd w:val="clear" w:color="auto" w:fill="F7EFD8"/>
           </w:tcPr>
           <w:p>
             <w:r/>
             <w:r>
               <w:rPr>
                 <w:b/>
+                <w:color w:val="A8780F"/>
                 <w:sz w:val="16"/>
               </w:rPr>
               <w:t>Enfoque</w:t>
@@ -1176,13 +1185,14 @@
         <w:tc>
           <w:tcPr>
             <w:tcW w:type="dxa" w:w="1134"/>
-            <w:shd w:val="clear" w:color="auto" w:fill="DCE3EE"/>
+            <w:shd w:val="clear" w:color="auto" w:fill="F7EFD8"/>
           </w:tcPr>
           <w:p>
             <w:r/>
             <w:r>
               <w:rPr>
                 <w:b/>
+                <w:color w:val="A8780F"/>
                 <w:sz w:val="16"/>
               </w:rPr>
               <w:t>Tiempo</w:t>
@@ -1192,13 +1202,14 @@
         <w:tc>
           <w:tcPr>
             <w:tcW w:type="dxa" w:w="4139"/>
-            <w:shd w:val="clear" w:color="auto" w:fill="DCE3EE"/>
+            <w:shd w:val="clear" w:color="auto" w:fill="F7EFD8"/>
           </w:tcPr>
           <w:p>
             <w:r/>
             <w:r>
               <w:rPr>
                 <w:b/>
+                <w:color w:val="A8780F"/>
                 <w:sz w:val="16"/>
               </w:rPr>
               <w:t>Imagen (animación)</w:t>
@@ -1208,13 +1219,14 @@
         <w:tc>
           <w:tcPr>
             <w:tcW w:type="dxa" w:w="4082"/>
-            <w:shd w:val="clear" w:color="auto" w:fill="DCE3EE"/>
+            <w:shd w:val="clear" w:color="auto" w:fill="F7EFD8"/>
           </w:tcPr>
           <w:p>
             <w:r/>
             <w:r>
               <w:rPr>
                 <w:b/>
+                <w:color w:val="A8780F"/>
                 <w:sz w:val="16"/>
               </w:rPr>
               <w:t>Voz en off / texto</w:t>
@@ -1506,7 +1518,7 @@
         <w:rPr>
           <w:b/>
           <w:i w:val="0"/>
-          <w:color w:val="2B3A55"/>
+          <w:color w:val="A8780F"/>
           <w:sz w:val="23"/>
         </w:rPr>
         <w:t>4. Plan de trabajo y plazo</w:t>
@@ -1539,13 +1551,14 @@
         <w:tc>
           <w:tcPr>
             <w:tcW w:type="dxa" w:w="850"/>
-            <w:shd w:val="clear" w:color="auto" w:fill="DCE3EE"/>
+            <w:shd w:val="clear" w:color="auto" w:fill="F7EFD8"/>
           </w:tcPr>
           <w:p>
             <w:r/>
             <w:r>
               <w:rPr>
                 <w:b/>
+                <w:color w:val="A8780F"/>
                 <w:sz w:val="16"/>
               </w:rPr>
               <w:t>Día</w:t>
@@ -1555,13 +1568,14 @@
         <w:tc>
           <w:tcPr>
             <w:tcW w:type="dxa" w:w="8504"/>
-            <w:shd w:val="clear" w:color="auto" w:fill="DCE3EE"/>
+            <w:shd w:val="clear" w:color="auto" w:fill="F7EFD8"/>
           </w:tcPr>
           <w:p>
             <w:r/>
             <w:r>
               <w:rPr>
                 <w:b/>
+                <w:color w:val="A8780F"/>
                 <w:sz w:val="16"/>
               </w:rPr>
               <w:t>Hito</w:t>
@@ -1739,7 +1753,7 @@
         <w:rPr>
           <w:b/>
           <w:i w:val="0"/>
-          <w:color w:val="2B3A55"/>
+          <w:color w:val="A8780F"/>
           <w:sz w:val="23"/>
         </w:rPr>
         <w:t>5. Equipo</w:t>
@@ -1789,7 +1803,7 @@
         <w:rPr>
           <w:b/>
           <w:i w:val="0"/>
-          <w:color w:val="2B3A55"/>
+          <w:color w:val="A8780F"/>
           <w:sz w:val="23"/>
         </w:rPr>
         <w:t>6. Muestra de capacidad</w:t>
@@ -1839,7 +1853,7 @@
         <w:rPr>
           <w:b/>
           <w:i w:val="0"/>
-          <w:color w:val="2B3A55"/>
+          <w:color w:val="A8780F"/>
           <w:sz w:val="23"/>
         </w:rPr>
         <w:t>7. Condiciones</w:t>
@@ -1953,6 +1967,7 @@
       </w:r>
     </w:p>
     <w:sectPr>
+      <w:headerReference w:type="default" r:id="rId9"/>
       <w:pgSz w:w="12240" w:h="15840"/>
       <w:pgMar w:top="850" w:right="1247" w:bottom="850" w:left="1247" w:header="720" w:footer="720" w:gutter="0"/>
       <w:cols w:space="720"/>
@@ -1960,6 +1975,51 @@
     </w:sectPr>
   </w:body>
 </w:document>
+</file>
+
+<file path=word/header1.xml><?xml version="1.0" encoding="utf-8"?>
+<w:hdr xmlns:m="http://schemas.openxmlformats.org/officeDocument/2006/math" xmlns:mc="http://schemas.openxmlformats.org/markup-compatibility/2006" xmlns:mo="http://schemas.microsoft.com/office/mac/office/2008/main" xmlns:mv="urn:schemas-microsoft-com:mac:vml" xmlns:o="urn:schemas-microsoft-com:office:office" xmlns:r="http://schemas.openxmlformats.org/officeDocument/2006/relationships" xmlns:v="urn:schemas-microsoft-com:vml" xmlns:w10="urn:schemas-microsoft-com:office:word" xmlns:w14="http://schemas.microsoft.com/office/word/2010/wordml" xmlns:w="http://schemas.openxmlformats.org/wordprocessingml/2006/main" xmlns:wne="http://schemas.microsoft.com/office/word/2006/wordml" xmlns:wp14="http://schemas.microsoft.com/office/word/2010/wordprocessingDrawing" xmlns:wp="http://schemas.openxmlformats.org/drawingml/2006/wordprocessingDrawing" xmlns:wpc="http://schemas.microsoft.com/office/word/2010/wordprocessingCanvas" xmlns:wpg="http://schemas.microsoft.com/office/word/2010/wordprocessingGroup" xmlns:wpi="http://schemas.microsoft.com/office/word/2010/wordprocessingInk" xmlns:wps="http://schemas.microsoft.com/office/word/2010/wordprocessingShape" mc:Ignorable="w14 wp14">
+  <w:p>
+    <w:pPr>
+      <w:pStyle w:val="Header"/>
+      <w:jc w:val="center"/>
+    </w:pPr>
+    <w:r>
+      <w:drawing>
+        <wp:inline xmlns:a="http://schemas.openxmlformats.org/drawingml/2006/main" xmlns:pic="http://schemas.openxmlformats.org/drawingml/2006/picture">
+          <wp:extent cx="1152000" cy="672619"/>
+          <wp:docPr id="1" name="Picture 1"/>
+          <wp:cNvGraphicFramePr>
+            <a:graphicFrameLocks noChangeAspect="1"/>
+          </wp:cNvGraphicFramePr>
+          <a:graphic>
+            <a:graphicData uri="http://schemas.openxmlformats.org/drawingml/2006/picture">
+              <pic:pic>
+                <pic:nvPicPr>
+                  <pic:cNvPr id="0" name="logo.png"/>
+                  <pic:cNvPicPr/>
+                </pic:nvPicPr>
+                <pic:blipFill>
+                  <a:blip r:embed="rId1"/>
+                  <a:stretch>
+                    <a:fillRect/>
+                  </a:stretch>
+                </pic:blipFill>
+                <pic:spPr>
+                  <a:xfrm>
+                    <a:off x="0" y="0"/>
+                    <a:ext cx="1152000" cy="672619"/>
+                  </a:xfrm>
+                  <a:prstGeom prst="rect"/>
+                </pic:spPr>
+              </pic:pic>
+            </a:graphicData>
+          </a:graphic>
+        </wp:inline>
+      </w:drawing>
+    </w:r>
+  </w:p>
+</w:hdr>
 </file>
 
 <file path=word/numbering.xml><?xml version="1.0" encoding="utf-8"?>
@@ -2326,7 +2386,8 @@
     <w:qFormat/>
     <w:rsid w:val="00FC693F"/>
     <w:rPr>
-      <w:rFonts w:ascii="DejaVu Sans" w:hAnsi="DejaVu Sans"/>
+      <w:rFonts w:ascii="Noto Sans" w:hAnsi="Noto Sans"/>
+      <w:color w:val="233D63"/>
       <w:sz w:val="18"/>
     </w:rPr>
   </w:style>

</xml_diff>

<commit_message>
Firma de María en cotización CFT 1267913-13-COT26; firmas en plantilla
Co-Authored-By: Claude Opus 5.5 <noreply@anthropic.com>
Claude-Session: https://claude.ai/code/session_01SfkxKP6KzgHJNPZStZzsYX
</commit_message>
<xml_diff>
--- a/Barrido_2026-10-26/03_Compra_Agil/1267913-13-COT26_CFTAntofagasta_capsulas_1M_cierra_30-10/ENVIAR/Cotizacion_Propuesta_1267913-13-COT26_StudiosConari.docx
+++ b/Barrido_2026-10-26/03_Compra_Agil/1267913-13-COT26_CFTAntofagasta_capsulas_1M_cierra_30-10/ENVIAR/Cotizacion_Propuesta_1267913-13-COT26_StudiosConari.docx
@@ -1919,6 +1919,42 @@
       </w:r>
     </w:p>
     <w:p>
+      <w:r>
+        <w:drawing>
+          <wp:inline xmlns:a="http://schemas.openxmlformats.org/drawingml/2006/main" xmlns:pic="http://schemas.openxmlformats.org/drawingml/2006/picture">
+            <wp:extent cx="1224000" cy="743551"/>
+            <wp:docPr id="1" name="Picture 1"/>
+            <wp:cNvGraphicFramePr>
+              <a:graphicFrameLocks noChangeAspect="1"/>
+            </wp:cNvGraphicFramePr>
+            <a:graphic>
+              <a:graphicData uri="http://schemas.openxmlformats.org/drawingml/2006/picture">
+                <pic:pic>
+                  <pic:nvPicPr>
+                    <pic:cNvPr id="0" name="firma_maria.png"/>
+                    <pic:cNvPicPr/>
+                  </pic:nvPicPr>
+                  <pic:blipFill>
+                    <a:blip r:embed="rId10"/>
+                    <a:stretch>
+                      <a:fillRect/>
+                    </a:stretch>
+                  </pic:blipFill>
+                  <pic:spPr>
+                    <a:xfrm>
+                      <a:off x="0" y="0"/>
+                      <a:ext cx="1224000" cy="743551"/>
+                    </a:xfrm>
+                    <a:prstGeom prst="rect"/>
+                  </pic:spPr>
+                </pic:pic>
+              </a:graphicData>
+            </a:graphic>
+          </wp:inline>
+        </w:drawing>
+      </w:r>
+    </w:p>
+    <w:p>
       <w:pPr>
         <w:spacing w:after="20"/>
       </w:pPr>

</xml_diff>